<commit_message>
Her home address comes off every report and template
Founder instruction, 28 Sep 2026: her home address is not printed on the
documents. The only addresses on a document are the ones invoicing needs:
the client's, and the worker's on a pay invoice, which the invoices already
carry. Removed from the report cover byline and footer on every kind, and
from the blank templates, rebuilt. The desk's deploy copy is refreshed to
match.

Co-Authored-By: Claude Opus 5.5 <noreply@anthropic.com>
</commit_message>
<xml_diff>
--- a/concierge-deploy/public/templates/condition-report.docx
+++ b/concierge-deploy/public/templates/condition-report.docx
@@ -521,7 +521,7 @@
           <w:sz w:val="16"/>
           <w:szCs w:val="16"/>
         </w:rPr>
-        <w:t xml:space="preserve">, seven years of UK construction and IoT project management, supplying professional services as a sole trader, 55 Remington Road, London N15 6SS. Every finding in this report is rated by her and nobody else, from what was seen on site and the photographs taken there. She is a project manager. She is not a chartered surveyor, a structural engineer, or a licensed electrician, plumber or pest control operator, and nothing in this report is offered as their work. What it does not do: value the property, confirm title, give a structural engineering opinion, set boundaries, or estimate what the repairs should cost.</w:t>
+        <w:t xml:space="preserve">, seven years of UK construction and IoT project management, supplying professional services as a sole trader. Every finding in this report is rated by her and nobody else, from what was seen on site and the photographs taken there. She is a project manager. She is not a chartered surveyor, a structural engineer, or a licensed electrician, plumber or pest control operator, and nothing in this report is offered as their work. What it does not do: value the property, confirm title, give a structural engineering opinion, set boundaries, or estimate what the repairs should cost.</w:t>
       </w:r>
     </w:p>
     <w:p>
@@ -20863,7 +20863,7 @@
         <w:sz w:val="14"/>
         <w:szCs w:val="14"/>
       </w:rPr>
-      <w:t xml:space="preserve">Supplied by Monique Sewell-Bennett, sole trader, 55 Remington Road, London N15 6SS</w:t>
+      <w:t xml:space="preserve">Supplied by Monique Sewell-Bennett, sole trader</w:t>
     </w:r>
     <w:r>
       <w:rPr>

</xml_diff>